<commit_message>
feat : NoSQL database
</commit_message>
<xml_diff>
--- a/07_Normalisasi/TP/Modul07_TP_103122400040_AnantaPutiMaharani.docx
+++ b/07_Normalisasi/TP/Modul07_TP_103122400040_AnantaPutiMaharani.docx
@@ -59,7 +59,15 @@
           <w:b/>
           <w:bCs/>
         </w:rPr>
-        <w:t>10</w:t>
+        <w:t>1</w:t>
+      </w:r>
+      <w:r>
+        <w:rPr>
+          <w:rFonts w:ascii="Times New Roman" w:hAnsi="Times New Roman" w:cs="Times New Roman"/>
+          <w:b/>
+          <w:bCs/>
+        </w:rPr>
+        <w:t>2</w:t>
       </w:r>
     </w:p>
     <w:p>
@@ -148,13 +156,26 @@
           <w:lang w:val="en-ID" w:eastAsia="en-ID"/>
           <w14:ligatures w14:val="none"/>
         </w:rPr>
-        <w:t>10_Overview_NoSQL</w:t>
+        <w:t>12_NoSQL_Columnar_Database</w:t>
       </w:r>
     </w:p>
     <w:p>
       <w:pPr>
         <w:jc w:val="center"/>
         <w:rPr>
+          <w:rFonts w:ascii="Times New Roman" w:eastAsia="Times New Roman" w:hAnsi="Times New Roman" w:cs="Times New Roman"/>
+          <w:b/>
+          <w:bCs/>
+          <w:kern w:val="0"/>
+          <w:lang w:val="en-ID" w:eastAsia="en-ID"/>
+          <w14:ligatures w14:val="none"/>
+        </w:rPr>
+      </w:pPr>
+    </w:p>
+    <w:p>
+      <w:pPr>
+        <w:jc w:val="center"/>
+        <w:rPr>
           <w:rFonts w:ascii="Times New Roman" w:hAnsi="Times New Roman" w:cs="Times New Roman"/>
           <w:b/>
           <w:bCs/>
@@ -213,6 +234,7 @@
         </w:rPr>
         <w:t>Ananta Puti Maharani</w:t>
       </w:r>
+      <w:proofErr w:type="gramStart"/>
       <w:r>
         <w:rPr>
           <w:rFonts w:ascii="Times New Roman" w:hAnsi="Times New Roman" w:cs="Times New Roman"/>
@@ -237,6 +259,7 @@
         </w:rPr>
         <w:t>03122400040</w:t>
       </w:r>
+      <w:proofErr w:type="gramEnd"/>
     </w:p>
     <w:p>
       <w:pPr>
@@ -402,406 +425,7 @@
           <w:b/>
           <w:bCs/>
         </w:rPr>
-        <w:t>JURNAL</w:t>
-      </w:r>
-    </w:p>
-    <w:p>
-      <w:pPr>
-        <w:pStyle w:val="ListParagraph"/>
-        <w:numPr>
-          <w:ilvl w:val="0"/>
-          <w:numId w:val="1"/>
-        </w:numPr>
-        <w:ind w:left="567"/>
-        <w:rPr>
-          <w:rFonts w:ascii="Times New Roman" w:hAnsi="Times New Roman" w:cs="Times New Roman"/>
-          <w:lang w:val="en-ID"/>
-        </w:rPr>
-      </w:pPr>
-      <w:r>
-        <w:rPr>
-          <w:rFonts w:ascii="Times New Roman" w:hAnsi="Times New Roman" w:cs="Times New Roman"/>
-          <w:lang w:val="en-ID"/>
-        </w:rPr>
-        <w:t>Andi adalah seorang kepala warehouse beras Bulog yang ingin membangun sistem ERP</w:t>
-      </w:r>
-    </w:p>
-    <w:p>
-      <w:pPr>
-        <w:ind w:left="567"/>
-        <w:rPr>
-          <w:rFonts w:ascii="Times New Roman" w:hAnsi="Times New Roman" w:cs="Times New Roman"/>
-          <w:lang w:val="en-ID"/>
-        </w:rPr>
-      </w:pPr>
-      <w:r>
-        <w:rPr>
-          <w:rFonts w:ascii="Times New Roman" w:hAnsi="Times New Roman" w:cs="Times New Roman"/>
-          <w:lang w:val="en-ID"/>
-        </w:rPr>
-        <w:t>sederhana. Sistem ini harus mencatat stok masuk-keluar secara real time dari berbagai</w:t>
-      </w:r>
-    </w:p>
-    <w:p>
-      <w:pPr>
-        <w:ind w:left="567"/>
-        <w:rPr>
-          <w:rFonts w:ascii="Times New Roman" w:hAnsi="Times New Roman" w:cs="Times New Roman"/>
-          <w:lang w:val="en-ID"/>
-        </w:rPr>
-      </w:pPr>
-      <w:r>
-        <w:rPr>
-          <w:rFonts w:ascii="Times New Roman" w:hAnsi="Times New Roman" w:cs="Times New Roman"/>
-          <w:lang w:val="en-ID"/>
-        </w:rPr>
-        <w:t>gudang di seluruh Indonesia. Data yang dicatat meliputi jumlah karung, jenis beras,</w:t>
-      </w:r>
-    </w:p>
-    <w:p>
-      <w:pPr>
-        <w:ind w:left="567"/>
-        <w:rPr>
-          <w:rFonts w:ascii="Times New Roman" w:hAnsi="Times New Roman" w:cs="Times New Roman"/>
-          <w:lang w:val="en-ID"/>
-        </w:rPr>
-      </w:pPr>
-      <w:r>
-        <w:rPr>
-          <w:rFonts w:ascii="Times New Roman" w:hAnsi="Times New Roman" w:cs="Times New Roman"/>
-          <w:lang w:val="en-ID"/>
-        </w:rPr>
-        <w:t>tanggal kedaluwarsa, dan suhu gudang.</w:t>
-      </w:r>
-    </w:p>
-    <w:p>
-      <w:pPr>
-        <w:pStyle w:val="ListParagraph"/>
-        <w:numPr>
-          <w:ilvl w:val="0"/>
-          <w:numId w:val="2"/>
-        </w:numPr>
-        <w:rPr>
-          <w:rFonts w:ascii="Times New Roman" w:hAnsi="Times New Roman" w:cs="Times New Roman"/>
-          <w:lang w:val="en-ID"/>
-        </w:rPr>
-      </w:pPr>
-      <w:r>
-        <w:rPr>
-          <w:rFonts w:ascii="Times New Roman" w:hAnsi="Times New Roman" w:cs="Times New Roman"/>
-          <w:lang w:val="en-ID"/>
-        </w:rPr>
-        <w:t>Tentukan tipe database NoSQL apa yang paling cocok digunakan untuk menangani</w:t>
-      </w:r>
-      <w:r>
-        <w:rPr>
-          <w:rFonts w:ascii="Times New Roman" w:hAnsi="Times New Roman" w:cs="Times New Roman"/>
-          <w:lang w:val="en-ID"/>
-        </w:rPr>
-        <w:t xml:space="preserve"> </w:t>
-      </w:r>
-      <w:r>
-        <w:rPr>
-          <w:rFonts w:ascii="Times New Roman" w:hAnsi="Times New Roman" w:cs="Times New Roman"/>
-          <w:lang w:val="en-ID"/>
-        </w:rPr>
-        <w:t>data sensor IoT dan riwayat stok yang sangat besar tersebut?</w:t>
-      </w:r>
-    </w:p>
-    <w:p>
-      <w:pPr>
-        <w:pStyle w:val="ListParagraph"/>
-        <w:rPr>
-          <w:rFonts w:ascii="Times New Roman" w:hAnsi="Times New Roman" w:cs="Times New Roman"/>
-          <w:lang w:val="en-ID"/>
-        </w:rPr>
-      </w:pPr>
-      <w:r>
-        <w:rPr>
-          <w:rFonts w:ascii="Times New Roman" w:hAnsi="Times New Roman" w:cs="Times New Roman"/>
-          <w:lang w:val="en-ID"/>
-        </w:rPr>
-        <w:t xml:space="preserve">Jawab : </w:t>
-      </w:r>
-      <w:r>
-        <w:rPr>
-          <w:rFonts w:ascii="Times New Roman" w:hAnsi="Times New Roman" w:cs="Times New Roman"/>
-        </w:rPr>
-        <w:t>Tipe database NoSQL yang paling cocok digunakan adalah Time-Series Database (TSDB).</w:t>
-      </w:r>
-    </w:p>
-    <w:p>
-      <w:pPr>
-        <w:pStyle w:val="ListParagraph"/>
-        <w:numPr>
-          <w:ilvl w:val="0"/>
-          <w:numId w:val="2"/>
-        </w:numPr>
-        <w:rPr>
-          <w:rFonts w:ascii="Times New Roman" w:hAnsi="Times New Roman" w:cs="Times New Roman"/>
-          <w:b/>
-          <w:bCs/>
-        </w:rPr>
-      </w:pPr>
-      <w:r>
-        <w:rPr>
-          <w:rFonts w:ascii="Times New Roman" w:hAnsi="Times New Roman" w:cs="Times New Roman"/>
-          <w:lang w:val="en-ID"/>
-        </w:rPr>
-        <w:t>Jelaskan alasan teknis di balik pilihan tersebut</w:t>
-      </w:r>
-      <w:r>
-        <w:rPr>
-          <w:rFonts w:ascii="Times New Roman" w:hAnsi="Times New Roman" w:cs="Times New Roman"/>
-          <w:b/>
-          <w:bCs/>
-          <w:lang w:val="en-ID"/>
-        </w:rPr>
-        <w:t>.</w:t>
-      </w:r>
-    </w:p>
-    <w:p>
-      <w:pPr>
-        <w:pStyle w:val="ListParagraph"/>
-        <w:jc w:val="both"/>
-        <w:rPr>
-          <w:rFonts w:ascii="Times New Roman" w:hAnsi="Times New Roman" w:cs="Times New Roman"/>
-        </w:rPr>
-      </w:pPr>
-      <w:r>
-        <w:rPr>
-          <w:rFonts w:ascii="Times New Roman" w:hAnsi="Times New Roman" w:cs="Times New Roman"/>
-          <w:lang w:val="en-ID"/>
-        </w:rPr>
-        <w:t>Jawab :</w:t>
-      </w:r>
-      <w:r>
-        <w:rPr>
-          <w:rFonts w:ascii="Times New Roman" w:hAnsi="Times New Roman" w:cs="Times New Roman"/>
-          <w:lang w:val="en-ID"/>
-        </w:rPr>
-        <w:t xml:space="preserve"> </w:t>
-      </w:r>
-      <w:r>
-        <w:rPr>
-          <w:rFonts w:ascii="Times New Roman" w:hAnsi="Times New Roman" w:cs="Times New Roman"/>
-        </w:rPr>
-        <w:t>Time-Series Database dipilih karena data yang dikelola dalam sistem ERP warehouse bersifat berbasis waktu (time-series), seperti data suhu gudang dari sensor IoT dan riwayat stok masuk serta keluar. Setiap data memiliki atribut waktu (timestamp) yang menjadi kunci utama dalam penyimpanan dan analisis data.</w:t>
-      </w:r>
-    </w:p>
-    <w:p>
-      <w:pPr>
-        <w:pStyle w:val="ListParagraph"/>
-        <w:jc w:val="both"/>
-        <w:rPr>
-          <w:rFonts w:ascii="Times New Roman" w:hAnsi="Times New Roman" w:cs="Times New Roman"/>
-          <w:lang w:val="en-ID"/>
-        </w:rPr>
-      </w:pPr>
-      <w:r>
-        <w:rPr>
-          <w:rFonts w:ascii="Times New Roman" w:hAnsi="Times New Roman" w:cs="Times New Roman"/>
-          <w:lang w:val="en-ID"/>
-        </w:rPr>
-        <w:t>Selain itu, TSDB dirancang untuk menangani data dalam jumlah besar (high volume) dan data yang terus bertambah secara real-time (high velocity). Hal ini sangat sesuai dengan kebutuhan sistem warehouse yang memonitor banyak gudang secara bersamaan.</w:t>
-      </w:r>
-    </w:p>
-    <w:p>
-      <w:pPr>
-        <w:pStyle w:val="ListParagraph"/>
-        <w:jc w:val="both"/>
-        <w:rPr>
-          <w:rFonts w:ascii="Times New Roman" w:hAnsi="Times New Roman" w:cs="Times New Roman"/>
-          <w:lang w:val="en-ID"/>
-        </w:rPr>
-      </w:pPr>
-      <w:r>
-        <w:rPr>
-          <w:rFonts w:ascii="Times New Roman" w:hAnsi="Times New Roman" w:cs="Times New Roman"/>
-          <w:lang w:val="en-ID"/>
-        </w:rPr>
-        <w:t>Dari sisi performa, TSDB memiliki keunggulan dalam melakukan query berbasis rentang waktu (time-range query), seperti melihat data suhu dalam periode tertentu atau riwayat stok harian. TSDB juga mendukung kompresi data dan penyimpanan yang efisien, sehingga lebih optimal dibandingkan jenis NoSQL lainnya untuk kasus ini.</w:t>
-      </w:r>
-    </w:p>
-    <w:p>
-      <w:pPr>
-        <w:pStyle w:val="ListParagraph"/>
-        <w:jc w:val="both"/>
-        <w:rPr>
-          <w:rFonts w:ascii="Times New Roman" w:hAnsi="Times New Roman" w:cs="Times New Roman"/>
-          <w:lang w:val="en-ID"/>
-        </w:rPr>
-      </w:pPr>
-      <w:r>
-        <w:rPr>
-          <w:rFonts w:ascii="Times New Roman" w:hAnsi="Times New Roman" w:cs="Times New Roman"/>
-          <w:lang w:val="en-ID"/>
-        </w:rPr>
-        <w:t>Dengan demikian, penggunaan Time-Series Database memungkinkan sistem ERP warehouse dapat berjalan secara cepat, efisien, dan scalable dalam mengelola data IoT dan histori stok.</w:t>
-      </w:r>
-    </w:p>
-    <w:p>
-      <w:pPr>
-        <w:pStyle w:val="ListParagraph"/>
-        <w:numPr>
-          <w:ilvl w:val="0"/>
-          <w:numId w:val="1"/>
-        </w:numPr>
-        <w:rPr>
-          <w:rFonts w:ascii="Times New Roman" w:hAnsi="Times New Roman" w:cs="Times New Roman"/>
-        </w:rPr>
-      </w:pPr>
-      <w:r>
-        <w:rPr>
-          <w:rFonts w:ascii="Times New Roman" w:hAnsi="Times New Roman" w:cs="Times New Roman"/>
-        </w:rPr>
-        <w:lastRenderedPageBreak/>
-        <w:drawing>
-          <wp:inline distT="0" distB="0" distL="0" distR="0" wp14:anchorId="642C5054" wp14:editId="23E0B81A">
-            <wp:extent cx="5612130" cy="2305050"/>
-            <wp:effectExtent l="0" t="0" r="0" b="3175"/>
-            <wp:docPr id="1712436007" name="Picture 1"/>
-            <wp:cNvGraphicFramePr>
-              <a:graphicFrameLocks xmlns:a="http://schemas.openxmlformats.org/drawingml/2006/main" noChangeAspect="1"/>
-            </wp:cNvGraphicFramePr>
-            <a:graphic xmlns:a="http://schemas.openxmlformats.org/drawingml/2006/main">
-              <a:graphicData uri="http://schemas.openxmlformats.org/drawingml/2006/picture">
-                <pic:pic xmlns:pic="http://schemas.openxmlformats.org/drawingml/2006/picture">
-                  <pic:nvPicPr>
-                    <pic:cNvPr id="1712436007" name=""/>
-                    <pic:cNvPicPr/>
-                  </pic:nvPicPr>
-                  <pic:blipFill>
-                    <a:blip r:embed="rId15"/>
-                    <a:stretch>
-                      <a:fillRect/>
-                    </a:stretch>
-                  </pic:blipFill>
-                  <pic:spPr>
-                    <a:xfrm>
-                      <a:off x="0" y="0"/>
-                      <a:ext cx="5612130" cy="2305050"/>
-                    </a:xfrm>
-                    <a:prstGeom prst="rect">
-                      <a:avLst/>
-                    </a:prstGeom>
-                  </pic:spPr>
-                </pic:pic>
-              </a:graphicData>
-            </a:graphic>
-          </wp:inline>
-        </w:drawing>
-      </w:r>
-    </w:p>
-    <w:p>
-      <w:pPr>
-        <w:pStyle w:val="ListParagraph"/>
-        <w:rPr>
-          <w:rFonts w:ascii="Times New Roman" w:hAnsi="Times New Roman" w:cs="Times New Roman"/>
-        </w:rPr>
-      </w:pPr>
-      <w:r>
-        <w:rPr>
-          <w:rFonts w:ascii="Times New Roman" w:hAnsi="Times New Roman" w:cs="Times New Roman"/>
-          <w:noProof/>
-        </w:rPr>
-        <w:drawing>
-          <wp:inline distT="0" distB="0" distL="0" distR="0" wp14:anchorId="530C2746" wp14:editId="6DFD9F10">
-            <wp:extent cx="4921155" cy="2366662"/>
-            <wp:effectExtent l="0" t="0" r="0" b="0"/>
-            <wp:docPr id="1792023555" name="Picture 2"/>
-            <wp:cNvGraphicFramePr>
-              <a:graphicFrameLocks xmlns:a="http://schemas.openxmlformats.org/drawingml/2006/main" noChangeAspect="1"/>
-            </wp:cNvGraphicFramePr>
-            <a:graphic xmlns:a="http://schemas.openxmlformats.org/drawingml/2006/main">
-              <a:graphicData uri="http://schemas.openxmlformats.org/drawingml/2006/picture">
-                <pic:pic xmlns:pic="http://schemas.openxmlformats.org/drawingml/2006/picture">
-                  <pic:nvPicPr>
-                    <pic:cNvPr id="0" name="Picture 2"/>
-                    <pic:cNvPicPr>
-                      <a:picLocks noChangeAspect="1" noChangeArrowheads="1"/>
-                    </pic:cNvPicPr>
-                  </pic:nvPicPr>
-                  <pic:blipFill>
-                    <a:blip r:embed="rId16" cstate="print">
-                      <a:extLst>
-                        <a:ext uri="{28A0092B-C50C-407E-A947-70E740481C1C}">
-                          <a14:useLocalDpi xmlns:a14="http://schemas.microsoft.com/office/drawing/2010/main" val="0"/>
-                        </a:ext>
-                      </a:extLst>
-                    </a:blip>
-                    <a:srcRect/>
-                    <a:stretch>
-                      <a:fillRect/>
-                    </a:stretch>
-                  </pic:blipFill>
-                  <pic:spPr bwMode="auto">
-                    <a:xfrm>
-                      <a:off x="0" y="0"/>
-                      <a:ext cx="4937763" cy="2374649"/>
-                    </a:xfrm>
-                    <a:prstGeom prst="rect">
-                      <a:avLst/>
-                    </a:prstGeom>
-                    <a:noFill/>
-                  </pic:spPr>
-                </pic:pic>
-              </a:graphicData>
-            </a:graphic>
-          </wp:inline>
-        </w:drawing>
-      </w:r>
-    </w:p>
-    <w:p>
-      <w:pPr>
-        <w:pStyle w:val="ListParagraph"/>
-        <w:numPr>
-          <w:ilvl w:val="0"/>
-          <w:numId w:val="1"/>
-        </w:numPr>
-        <w:rPr>
-          <w:rFonts w:ascii="Times New Roman" w:hAnsi="Times New Roman" w:cs="Times New Roman"/>
-        </w:rPr>
-      </w:pPr>
-      <w:r>
-        <w:rPr>
-          <w:rFonts w:ascii="Times New Roman" w:hAnsi="Times New Roman" w:cs="Times New Roman"/>
-        </w:rPr>
-        <w:drawing>
-          <wp:inline distT="0" distB="0" distL="0" distR="0" wp14:anchorId="694CCA50" wp14:editId="606F4FB1">
-            <wp:extent cx="5612130" cy="3058160"/>
-            <wp:effectExtent l="0" t="0" r="7620" b="8890"/>
-            <wp:docPr id="1992175924" name="Picture 1"/>
-            <wp:cNvGraphicFramePr>
-              <a:graphicFrameLocks xmlns:a="http://schemas.openxmlformats.org/drawingml/2006/main" noChangeAspect="1"/>
-            </wp:cNvGraphicFramePr>
-            <a:graphic xmlns:a="http://schemas.openxmlformats.org/drawingml/2006/main">
-              <a:graphicData uri="http://schemas.openxmlformats.org/drawingml/2006/picture">
-                <pic:pic xmlns:pic="http://schemas.openxmlformats.org/drawingml/2006/picture">
-                  <pic:nvPicPr>
-                    <pic:cNvPr id="1992175924" name=""/>
-                    <pic:cNvPicPr/>
-                  </pic:nvPicPr>
-                  <pic:blipFill>
-                    <a:blip r:embed="rId17"/>
-                    <a:stretch>
-                      <a:fillRect/>
-                    </a:stretch>
-                  </pic:blipFill>
-                  <pic:spPr>
-                    <a:xfrm>
-                      <a:off x="0" y="0"/>
-                      <a:ext cx="5612130" cy="3058160"/>
-                    </a:xfrm>
-                    <a:prstGeom prst="rect">
-                      <a:avLst/>
-                    </a:prstGeom>
-                  </pic:spPr>
-                </pic:pic>
-              </a:graphicData>
-            </a:graphic>
-          </wp:inline>
-        </w:drawing>
+        <w:t>TUGAS PENDAHULUAN</w:t>
       </w:r>
     </w:p>
     <w:p>

</xml_diff>